<commit_message>
backup du lieu 29/9
</commit_message>
<xml_diff>
--- a/A1_Phan_tich_nghiep_vu_Ling_IELTS (1).docx
+++ b/A1_Phan_tich_nghiep_vu_Ling_IELTS (1).docx
@@ -1,6 +1,6 @@
 
 <file path=word/document.xml><?xml version="1.0" encoding="utf-8"?>
-<w:document xmlns:wpc="http://schemas.microsoft.com/office/word/2010/wordprocessingCanvas" xmlns:cx="http://schemas.microsoft.com/office/drawing/2014/chartex" xmlns:cx1="http://schemas.microsoft.com/office/drawing/2015/9/8/chartex" xmlns:cx2="http://schemas.microsoft.com/office/drawing/2015/10/21/chartex" xmlns:cx3="http://schemas.microsoft.com/office/drawing/2016/5/9/chartex" xmlns:cx4="http://schemas.microsoft.com/office/drawing/2016/5/10/chartex" xmlns:cx5="http://schemas.microsoft.com/office/drawing/2016/5/11/chartex" xmlns:cx6="http://schemas.microsoft.com/office/drawing/2016/5/12/chartex" xmlns:cx7="http://schemas.microsoft.com/office/drawing/2016/5/13/chartex" xmlns:cx8="http://schemas.microsoft.com/office/drawing/2016/5/14/chartex" xmlns:mc="http://schemas.openxmlformats.org/markup-compatibility/2006" xmlns:aink="http://schemas.microsoft.com/office/drawing/2016/ink" xmlns:am3d="http://schemas.microsoft.com/office/drawing/2017/model3d" xmlns:o="urn:schemas-microsoft-com:office:office" xmlns:oel="http://schemas.microsoft.com/office/2019/extlst" xmlns:r="http://schemas.openxmlformats.org/officeDocument/2006/relationships" xmlns:m="http://schemas.openxmlformats.org/officeDocument/2006/math" xmlns:v="urn:schemas-microsoft-com:vml" xmlns:wp14="http://schemas.microsoft.com/office/word/2010/wordprocessingDrawing" xmlns:wp="http://schemas.openxmlformats.org/drawingml/2006/wordprocessingDrawing" xmlns:w10="urn:schemas-microsoft-com:office:word" xmlns:w="http://schemas.openxmlformats.org/wordprocessingml/2006/main" xmlns:w14="http://schemas.microsoft.com/office/word/2010/wordml" xmlns:w15="http://schemas.microsoft.com/office/word/2012/wordml" xmlns:w16cex="http://schemas.microsoft.com/office/word/2018/wordml/cex" xmlns:w16cid="http://schemas.microsoft.com/office/word/2016/wordml/cid" xmlns:w16="http://schemas.microsoft.com/office/word/2018/wordml" xmlns:w16sdtdh="http://schemas.microsoft.com/office/word/2020/wordml/sdtdatahash" xmlns:w16se="http://schemas.microsoft.com/office/word/2015/wordml/symex" xmlns:wpg="http://schemas.microsoft.com/office/word/2010/wordprocessingGroup" xmlns:wpi="http://schemas.microsoft.com/office/word/2010/wordprocessingInk" xmlns:wne="http://schemas.microsoft.com/office/word/2006/wordml" xmlns:wps="http://schemas.microsoft.com/office/word/2010/wordprocessingShape" mc:Ignorable="w14 w15 w16se w16cid w16 w16cex w16sdtdh wp14">
+<w:document xmlns:wpc="http://schemas.microsoft.com/office/word/2010/wordprocessingCanvas" xmlns:cx="http://schemas.microsoft.com/office/drawing/2014/chartex" xmlns:cx1="http://schemas.microsoft.com/office/drawing/2015/9/8/chartex" xmlns:cx2="http://schemas.microsoft.com/office/drawing/2015/10/21/chartex" xmlns:cx3="http://schemas.microsoft.com/office/drawing/2016/5/9/chartex" xmlns:cx4="http://schemas.microsoft.com/office/drawing/2016/5/10/chartex" xmlns:cx5="http://schemas.microsoft.com/office/drawing/2016/5/11/chartex" xmlns:cx6="http://schemas.microsoft.com/office/drawing/2016/5/12/chartex" xmlns:cx7="http://schemas.microsoft.com/office/drawing/2016/5/13/chartex" xmlns:cx8="http://schemas.microsoft.com/office/drawing/2016/5/14/chartex" xmlns:mc="http://schemas.openxmlformats.org/markup-compatibility/2006" xmlns:aink="http://schemas.microsoft.com/office/drawing/2016/ink" xmlns:am3d="http://schemas.microsoft.com/office/drawing/2017/model3d" xmlns:o="urn:schemas-microsoft-com:office:office" xmlns:oel="http://schemas.microsoft.com/office/2019/extlst" xmlns:r="http://schemas.openxmlformats.org/officeDocument/2006/relationships" xmlns:m="http://schemas.openxmlformats.org/officeDocument/2006/math" xmlns:v="urn:schemas-microsoft-com:vml" xmlns:wp14="http://schemas.microsoft.com/office/word/2010/wordprocessingDrawing" xmlns:wp="http://schemas.openxmlformats.org/drawingml/2006/wordprocessingDrawing" xmlns:w10="urn:schemas-microsoft-com:office:word" xmlns:w="http://schemas.openxmlformats.org/wordprocessingml/2006/main" xmlns:w14="http://schemas.microsoft.com/office/word/2010/wordml" xmlns:w15="http://schemas.microsoft.com/office/word/2012/wordml" xmlns:w16cex="http://schemas.microsoft.com/office/word/2018/wordml/cex" xmlns:w16cid="http://schemas.microsoft.com/office/word/2016/wordml/cid" xmlns:w16="http://schemas.microsoft.com/office/word/2018/wordml" xmlns:w16du="http://schemas.microsoft.com/office/word/2023/wordml/word16du" xmlns:w16sdtdh="http://schemas.microsoft.com/office/word/2020/wordml/sdtdatahash" xmlns:w16sdtfl="http://schemas.microsoft.com/office/word/2024/wordml/sdtformatlock" xmlns:w16se="http://schemas.microsoft.com/office/word/2015/wordml/symex" xmlns:wpg="http://schemas.microsoft.com/office/word/2010/wordprocessingGroup" xmlns:wpi="http://schemas.microsoft.com/office/word/2010/wordprocessingInk" xmlns:wne="http://schemas.microsoft.com/office/word/2006/wordml" xmlns:wps="http://schemas.microsoft.com/office/word/2010/wordprocessingShape" mc:Ignorable="w14 w15 w16se w16cid w16 w16cex w16sdtdh w16sdtfl w16du wp14">
   <w:body>
     <w:p>
       <w:pPr>
@@ -11860,63 +11860,7 @@
         <w:spacing w:after="160" w:line="276" w:lineRule="auto"/>
       </w:pPr>
       <w:r>
-        <w:t xml:space="preserve">Các quy tắc nghiệp vụ dưới đây tập trung vào các luồng có logic tính toán hoặc điều kiện rẽ nhánh — chủ yếu là Luồng 4 (học phí) và Luồng 5 (chuyển cấp độ). Quy tắc chưa được trung tâm xác nhận đầy </w:t>
-      </w:r>
-      <w:proofErr w:type="spellStart"/>
-      <w:r>
-        <w:t>đủ</w:t>
-      </w:r>
-      <w:proofErr w:type="spellEnd"/>
-      <w:r>
-        <w:t xml:space="preserve"> </w:t>
-      </w:r>
-      <w:proofErr w:type="spellStart"/>
-      <w:r>
-        <w:t>được</w:t>
-      </w:r>
-      <w:proofErr w:type="spellEnd"/>
-      <w:r>
-        <w:t xml:space="preserve"> </w:t>
-      </w:r>
-      <w:proofErr w:type="spellStart"/>
-      <w:r>
-        <w:t>đánh</w:t>
-      </w:r>
-      <w:proofErr w:type="spellEnd"/>
-      <w:r>
-        <w:t xml:space="preserve"> </w:t>
-      </w:r>
-      <w:proofErr w:type="spellStart"/>
-      <w:r>
-        <w:t>dấu</w:t>
-      </w:r>
-      <w:proofErr w:type="spellEnd"/>
-      <w:r>
-        <w:t xml:space="preserve"> </w:t>
-      </w:r>
-      <w:proofErr w:type="spellStart"/>
-      <w:r>
-        <w:t>rõ</w:t>
-      </w:r>
-      <w:proofErr w:type="spellEnd"/>
-      <w:r>
-        <w:t xml:space="preserve"> </w:t>
-      </w:r>
-      <w:proofErr w:type="spellStart"/>
-      <w:r>
-        <w:t>trạng</w:t>
-      </w:r>
-      <w:proofErr w:type="spellEnd"/>
-      <w:r>
-        <w:t xml:space="preserve"> </w:t>
-      </w:r>
-      <w:proofErr w:type="spellStart"/>
-      <w:r>
-        <w:t>thái</w:t>
-      </w:r>
-      <w:proofErr w:type="spellEnd"/>
-      <w:r>
-        <w:t>.</w:t>
+        <w:t>Các quy tắc nghiệp vụ dưới đây tập trung vào các luồng có logic tính toán hoặc điều kiện rẽ nhánh — chủ yếu là Luồng 4 (học phí) và Luồng 5 (chuyển cấp độ). Quy tắc chưa được trung tâm xác nhận đầy đủ được đánh dấu rõ trạng thái.</w:t>
       </w:r>
     </w:p>
     <w:p>
@@ -12091,103 +12035,7 @@
                 <w:sz w:val="20"/>
                 <w:szCs w:val="20"/>
               </w:rPr>
-              <w:t xml:space="preserve">Quản lý có thể áp dụng giảm giá học phí cho học viên trong một số trường hợp; mức giảm và </w:t>
-            </w:r>
-            <w:proofErr w:type="spellStart"/>
-            <w:r>
-              <w:rPr>
-                <w:sz w:val="20"/>
-                <w:szCs w:val="20"/>
-              </w:rPr>
-              <w:t>điều</w:t>
-            </w:r>
-            <w:proofErr w:type="spellEnd"/>
-            <w:r>
-              <w:rPr>
-                <w:sz w:val="20"/>
-                <w:szCs w:val="20"/>
-              </w:rPr>
-              <w:t xml:space="preserve"> </w:t>
-            </w:r>
-            <w:proofErr w:type="spellStart"/>
-            <w:r>
-              <w:rPr>
-                <w:sz w:val="20"/>
-                <w:szCs w:val="20"/>
-              </w:rPr>
-              <w:t>kiện</w:t>
-            </w:r>
-            <w:proofErr w:type="spellEnd"/>
-            <w:r>
-              <w:rPr>
-                <w:sz w:val="20"/>
-                <w:szCs w:val="20"/>
-              </w:rPr>
-              <w:t xml:space="preserve"> </w:t>
-            </w:r>
-            <w:proofErr w:type="spellStart"/>
-            <w:r>
-              <w:rPr>
-                <w:sz w:val="20"/>
-                <w:szCs w:val="20"/>
-              </w:rPr>
-              <w:t>áp</w:t>
-            </w:r>
-            <w:proofErr w:type="spellEnd"/>
-            <w:r>
-              <w:rPr>
-                <w:sz w:val="20"/>
-                <w:szCs w:val="20"/>
-              </w:rPr>
-              <w:t xml:space="preserve"> </w:t>
-            </w:r>
-            <w:proofErr w:type="spellStart"/>
-            <w:r>
-              <w:rPr>
-                <w:sz w:val="20"/>
-                <w:szCs w:val="20"/>
-              </w:rPr>
-              <w:t>dụng</w:t>
-            </w:r>
-            <w:proofErr w:type="spellEnd"/>
-            <w:r>
-              <w:rPr>
-                <w:sz w:val="20"/>
-                <w:szCs w:val="20"/>
-              </w:rPr>
-              <w:t xml:space="preserve"> </w:t>
-            </w:r>
-            <w:proofErr w:type="spellStart"/>
-            <w:r>
-              <w:rPr>
-                <w:sz w:val="20"/>
-                <w:szCs w:val="20"/>
-              </w:rPr>
-              <w:t>cụ</w:t>
-            </w:r>
-            <w:proofErr w:type="spellEnd"/>
-            <w:r>
-              <w:rPr>
-                <w:sz w:val="20"/>
-                <w:szCs w:val="20"/>
-              </w:rPr>
-              <w:t xml:space="preserve"> </w:t>
-            </w:r>
-            <w:proofErr w:type="spellStart"/>
-            <w:r>
-              <w:rPr>
-                <w:sz w:val="20"/>
-                <w:szCs w:val="20"/>
-              </w:rPr>
-              <w:t>thể</w:t>
-            </w:r>
-            <w:proofErr w:type="spellEnd"/>
-            <w:r>
-              <w:rPr>
-                <w:sz w:val="20"/>
-                <w:szCs w:val="20"/>
-              </w:rPr>
-              <w:t xml:space="preserve"> do</w:t>
+              <w:t>Quản lý có thể áp dụng giảm giá học phí cho học viên trong một số trường hợp; mức giảm và điều kiện áp dụng cụ thể do</w:t>
             </w:r>
           </w:p>
         </w:tc>
@@ -12209,47 +12057,13 @@
                 <w:szCs w:val="20"/>
               </w:rPr>
             </w:pPr>
-            <w:proofErr w:type="spellStart"/>
-            <w:r>
-              <w:rPr>
-                <w:sz w:val="20"/>
-                <w:szCs w:val="20"/>
-              </w:rPr>
-              <w:t>Đã</w:t>
-            </w:r>
-            <w:proofErr w:type="spellEnd"/>
-            <w:r>
-              <w:rPr>
-                <w:sz w:val="20"/>
-                <w:szCs w:val="20"/>
-              </w:rPr>
-              <w:t xml:space="preserve"> </w:t>
-            </w:r>
-            <w:proofErr w:type="spellStart"/>
-            <w:r>
-              <w:rPr>
-                <w:sz w:val="20"/>
-                <w:szCs w:val="20"/>
-              </w:rPr>
-              <w:t>xác</w:t>
-            </w:r>
-            <w:proofErr w:type="spellEnd"/>
-            <w:r>
-              <w:rPr>
-                <w:sz w:val="20"/>
-                <w:szCs w:val="20"/>
-              </w:rPr>
-              <w:t xml:space="preserve"> </w:t>
-            </w:r>
-            <w:proofErr w:type="spellStart"/>
-            <w:r>
-              <w:rPr>
-                <w:sz w:val="20"/>
-                <w:szCs w:val="20"/>
-              </w:rPr>
-              <w:t>nhận</w:t>
-            </w:r>
-            <w:proofErr w:type="spellEnd"/>
+            <w:r>
+              <w:rPr>
+                <w:sz w:val="20"/>
+                <w:szCs w:val="20"/>
+              </w:rPr>
+              <w:t>Đã xác nhận</w:t>
+            </w:r>
           </w:p>
         </w:tc>
       </w:tr>
@@ -12317,39 +12131,13 @@
             <w:pPr>
               <w:spacing w:after="40"/>
             </w:pPr>
-            <w:proofErr w:type="spellStart"/>
-            <w:r>
-              <w:rPr>
-                <w:sz w:val="20"/>
-                <w:szCs w:val="20"/>
-              </w:rPr>
-              <w:t>Đã</w:t>
-            </w:r>
-            <w:proofErr w:type="spellEnd"/>
-            <w:r>
-              <w:rPr>
-                <w:sz w:val="20"/>
-                <w:szCs w:val="20"/>
-              </w:rPr>
-              <w:t xml:space="preserve"> </w:t>
-            </w:r>
-            <w:proofErr w:type="spellStart"/>
-            <w:r>
-              <w:rPr>
-                <w:sz w:val="20"/>
-                <w:szCs w:val="20"/>
-              </w:rPr>
-              <w:t>xác</w:t>
-            </w:r>
-            <w:proofErr w:type="spellEnd"/>
-            <w:r>
-              <w:rPr>
-                <w:sz w:val="20"/>
-                <w:szCs w:val="20"/>
-              </w:rPr>
-              <w:t xml:space="preserve"> </w:t>
-            </w:r>
-            <w:proofErr w:type="spellStart"/>
+            <w:r>
+              <w:rPr>
+                <w:sz w:val="20"/>
+                <w:szCs w:val="20"/>
+              </w:rPr>
+              <w:t xml:space="preserve">Đã xác </w:t>
+            </w:r>
             <w:r>
               <w:rPr>
                 <w:sz w:val="20"/>
@@ -12357,7 +12145,6 @@
               </w:rPr>
               <w:t>nhận</w:t>
             </w:r>
-            <w:proofErr w:type="spellEnd"/>
           </w:p>
         </w:tc>
       </w:tr>
@@ -12505,7 +12292,6 @@
             <w:pPr>
               <w:spacing w:after="40"/>
             </w:pPr>
-            <w:proofErr w:type="spellStart"/>
             <w:r>
               <w:rPr>
                 <w:b/>
@@ -12514,9 +12300,26 @@
                 <w:sz w:val="20"/>
                 <w:szCs w:val="20"/>
               </w:rPr>
-              <w:t>Cấp</w:t>
-            </w:r>
-            <w:proofErr w:type="spellEnd"/>
+              <w:t>Cấp độ (band)</w:t>
+            </w:r>
+          </w:p>
+        </w:tc>
+        <w:tc>
+          <w:tcPr>
+            <w:tcW w:w="4768" w:type="dxa"/>
+            <w:shd w:val="clear" w:color="auto" w:fill="1F4E79"/>
+            <w:tcMar>
+              <w:top w:w="100" w:type="dxa"/>
+              <w:left w:w="100" w:type="dxa"/>
+              <w:bottom w:w="100" w:type="dxa"/>
+              <w:right w:w="100" w:type="dxa"/>
+            </w:tcMar>
+            <w:vAlign w:val="center"/>
+          </w:tcPr>
+          <w:p>
+            <w:pPr>
+              <w:spacing w:after="40"/>
+            </w:pPr>
             <w:r>
               <w:rPr>
                 <w:b/>
@@ -12525,91 +12328,7 @@
                 <w:sz w:val="20"/>
                 <w:szCs w:val="20"/>
               </w:rPr>
-              <w:t xml:space="preserve"> </w:t>
-            </w:r>
-            <w:proofErr w:type="spellStart"/>
-            <w:r>
-              <w:rPr>
-                <w:b/>
-                <w:bCs/>
-                <w:color w:val="FFFFFF"/>
-                <w:sz w:val="20"/>
-                <w:szCs w:val="20"/>
-              </w:rPr>
-              <w:t>độ</w:t>
-            </w:r>
-            <w:proofErr w:type="spellEnd"/>
-            <w:r>
-              <w:rPr>
-                <w:b/>
-                <w:bCs/>
-                <w:color w:val="FFFFFF"/>
-                <w:sz w:val="20"/>
-                <w:szCs w:val="20"/>
-              </w:rPr>
-              <w:t xml:space="preserve"> (band)</w:t>
-            </w:r>
-          </w:p>
-        </w:tc>
-        <w:tc>
-          <w:tcPr>
-            <w:tcW w:w="4768" w:type="dxa"/>
-            <w:shd w:val="clear" w:color="auto" w:fill="1F4E79"/>
-            <w:tcMar>
-              <w:top w:w="100" w:type="dxa"/>
-              <w:left w:w="100" w:type="dxa"/>
-              <w:bottom w:w="100" w:type="dxa"/>
-              <w:right w:w="100" w:type="dxa"/>
-            </w:tcMar>
-            <w:vAlign w:val="center"/>
-          </w:tcPr>
-          <w:p>
-            <w:pPr>
-              <w:spacing w:after="40"/>
-            </w:pPr>
-            <w:proofErr w:type="spellStart"/>
-            <w:r>
-              <w:rPr>
-                <w:b/>
-                <w:bCs/>
-                <w:color w:val="FFFFFF"/>
-                <w:sz w:val="20"/>
-                <w:szCs w:val="20"/>
-              </w:rPr>
-              <w:t>Học</w:t>
-            </w:r>
-            <w:proofErr w:type="spellEnd"/>
-            <w:r>
-              <w:rPr>
-                <w:b/>
-                <w:bCs/>
-                <w:color w:val="FFFFFF"/>
-                <w:sz w:val="20"/>
-                <w:szCs w:val="20"/>
-              </w:rPr>
-              <w:t xml:space="preserve"> </w:t>
-            </w:r>
-            <w:proofErr w:type="spellStart"/>
-            <w:r>
-              <w:rPr>
-                <w:b/>
-                <w:bCs/>
-                <w:color w:val="FFFFFF"/>
-                <w:sz w:val="20"/>
-                <w:szCs w:val="20"/>
-              </w:rPr>
-              <w:t>phí</w:t>
-            </w:r>
-            <w:proofErr w:type="spellEnd"/>
-            <w:r>
-              <w:rPr>
-                <w:b/>
-                <w:bCs/>
-                <w:color w:val="FFFFFF"/>
-                <w:sz w:val="20"/>
-                <w:szCs w:val="20"/>
-              </w:rPr>
-              <w:t xml:space="preserve"> (VNĐ)</w:t>
+              <w:t>Học phí (VNĐ)</w:t>
             </w:r>
           </w:p>
         </w:tc>
@@ -12637,7 +12356,14 @@
                 <w:sz w:val="20"/>
                 <w:szCs w:val="20"/>
               </w:rPr>
-              <w:t>3.0 – 4.0</w:t>
+              <w:t xml:space="preserve">3.0 – </w:t>
+            </w:r>
+            <w:r>
+              <w:rPr>
+                <w:sz w:val="20"/>
+                <w:szCs w:val="20"/>
+              </w:rPr>
+              <w:t>3.5</w:t>
             </w:r>
           </w:p>
         </w:tc>
@@ -12688,7 +12414,14 @@
                 <w:sz w:val="20"/>
                 <w:szCs w:val="20"/>
               </w:rPr>
-              <w:t>4.0 – 5.0</w:t>
+              <w:t xml:space="preserve">4.0 – </w:t>
+            </w:r>
+            <w:r>
+              <w:rPr>
+                <w:sz w:val="20"/>
+                <w:szCs w:val="20"/>
+              </w:rPr>
+              <w:t>4.5</w:t>
             </w:r>
           </w:p>
         </w:tc>
@@ -12739,7 +12472,28 @@
                 <w:sz w:val="20"/>
                 <w:szCs w:val="20"/>
               </w:rPr>
-              <w:t>5.0 – 6.0</w:t>
+              <w:t xml:space="preserve">5.0 – </w:t>
+            </w:r>
+            <w:r>
+              <w:rPr>
+                <w:sz w:val="20"/>
+                <w:szCs w:val="20"/>
+              </w:rPr>
+              <w:t>5</w:t>
+            </w:r>
+            <w:r>
+              <w:rPr>
+                <w:sz w:val="20"/>
+                <w:szCs w:val="20"/>
+              </w:rPr>
+              <w:t>.</w:t>
+            </w:r>
+            <w:r>
+              <w:rPr>
+                <w:sz w:val="20"/>
+                <w:szCs w:val="20"/>
+              </w:rPr>
+              <w:t>5</w:t>
             </w:r>
           </w:p>
         </w:tc>
@@ -12790,7 +12544,28 @@
                 <w:sz w:val="20"/>
                 <w:szCs w:val="20"/>
               </w:rPr>
-              <w:t>6.0 – 7.0</w:t>
+              <w:t xml:space="preserve">6.0 – </w:t>
+            </w:r>
+            <w:r>
+              <w:rPr>
+                <w:sz w:val="20"/>
+                <w:szCs w:val="20"/>
+              </w:rPr>
+              <w:t>6</w:t>
+            </w:r>
+            <w:r>
+              <w:rPr>
+                <w:sz w:val="20"/>
+                <w:szCs w:val="20"/>
+              </w:rPr>
+              <w:t>.</w:t>
+            </w:r>
+            <w:r>
+              <w:rPr>
+                <w:sz w:val="20"/>
+                <w:szCs w:val="20"/>
+              </w:rPr>
+              <w:t>5</w:t>
             </w:r>
           </w:p>
         </w:tc>
@@ -12841,7 +12616,28 @@
                 <w:sz w:val="20"/>
                 <w:szCs w:val="20"/>
               </w:rPr>
-              <w:t>7.0 – 8.0</w:t>
+              <w:t xml:space="preserve">7.0 – </w:t>
+            </w:r>
+            <w:r>
+              <w:rPr>
+                <w:sz w:val="20"/>
+                <w:szCs w:val="20"/>
+              </w:rPr>
+              <w:t>7</w:t>
+            </w:r>
+            <w:r>
+              <w:rPr>
+                <w:sz w:val="20"/>
+                <w:szCs w:val="20"/>
+              </w:rPr>
+              <w:t>.</w:t>
+            </w:r>
+            <w:r>
+              <w:rPr>
+                <w:sz w:val="20"/>
+                <w:szCs w:val="20"/>
+              </w:rPr>
+              <w:t>5</w:t>
             </w:r>
           </w:p>
         </w:tc>
@@ -12893,7 +12689,28 @@
                 <w:szCs w:val="20"/>
               </w:rPr>
               <w:lastRenderedPageBreak/>
-              <w:t>8.0 – 9.0</w:t>
+              <w:t xml:space="preserve">8.0 – </w:t>
+            </w:r>
+            <w:r>
+              <w:rPr>
+                <w:sz w:val="20"/>
+                <w:szCs w:val="20"/>
+              </w:rPr>
+              <w:t>8</w:t>
+            </w:r>
+            <w:r>
+              <w:rPr>
+                <w:sz w:val="20"/>
+                <w:szCs w:val="20"/>
+              </w:rPr>
+              <w:t>.</w:t>
+            </w:r>
+            <w:r>
+              <w:rPr>
+                <w:sz w:val="20"/>
+                <w:szCs w:val="20"/>
+              </w:rPr>
+              <w:t>5</w:t>
             </w:r>
           </w:p>
         </w:tc>
@@ -12928,7 +12745,6 @@
         <w:spacing w:before="200" w:after="100"/>
       </w:pPr>
       <w:bookmarkStart w:id="50" w:name="_Toc240311041"/>
-      <w:proofErr w:type="spellStart"/>
       <w:r>
         <w:rPr>
           <w:b/>
@@ -12937,76 +12753,9 @@
           <w:sz w:val="22"/>
           <w:szCs w:val="22"/>
         </w:rPr>
-        <w:t>Nhóm</w:t>
-      </w:r>
-      <w:proofErr w:type="spellEnd"/>
-      <w:r>
-        <w:rPr>
-          <w:b/>
-          <w:bCs/>
-          <w:color w:val="2E75B6"/>
-          <w:sz w:val="22"/>
-          <w:szCs w:val="22"/>
-        </w:rPr>
-        <w:t xml:space="preserve"> </w:t>
-      </w:r>
-      <w:proofErr w:type="spellStart"/>
-      <w:r>
-        <w:rPr>
-          <w:b/>
-          <w:bCs/>
-          <w:color w:val="2E75B6"/>
-          <w:sz w:val="22"/>
-          <w:szCs w:val="22"/>
-        </w:rPr>
-        <w:t>chuyển</w:t>
-      </w:r>
-      <w:proofErr w:type="spellEnd"/>
-      <w:r>
-        <w:rPr>
-          <w:b/>
-          <w:bCs/>
-          <w:color w:val="2E75B6"/>
-          <w:sz w:val="22"/>
-          <w:szCs w:val="22"/>
-        </w:rPr>
-        <w:t xml:space="preserve"> </w:t>
-      </w:r>
-      <w:proofErr w:type="spellStart"/>
-      <w:r>
-        <w:rPr>
-          <w:b/>
-          <w:bCs/>
-          <w:color w:val="2E75B6"/>
-          <w:sz w:val="22"/>
-          <w:szCs w:val="22"/>
-        </w:rPr>
-        <w:t>cấp</w:t>
-      </w:r>
-      <w:proofErr w:type="spellEnd"/>
-      <w:r>
-        <w:rPr>
-          <w:b/>
-          <w:bCs/>
-          <w:color w:val="2E75B6"/>
-          <w:sz w:val="22"/>
-          <w:szCs w:val="22"/>
-        </w:rPr>
-        <w:t xml:space="preserve"> </w:t>
-      </w:r>
-      <w:proofErr w:type="spellStart"/>
-      <w:r>
-        <w:rPr>
-          <w:b/>
-          <w:bCs/>
-          <w:color w:val="2E75B6"/>
-          <w:sz w:val="22"/>
-          <w:szCs w:val="22"/>
-        </w:rPr>
-        <w:t>độ</w:t>
+        <w:t>Nhóm chuyển cấp độ</w:t>
       </w:r>
       <w:bookmarkEnd w:id="50"/>
-      <w:proofErr w:type="spellEnd"/>
     </w:p>
     <w:tbl>
       <w:tblPr>
@@ -14083,57 +13832,8 @@
                 <w:sz w:val="20"/>
                 <w:szCs w:val="20"/>
               </w:rPr>
-              <w:t xml:space="preserve">Thứ tự xử lý khi giáo viên nghỉ 1 buổi: (1) Thử lùi lịch sang khung giờ khác trong tuần, không kéo dài thời gian khóa; (2) Nếu không lùi được, tìm </w:t>
-            </w:r>
-            <w:proofErr w:type="spellStart"/>
-            <w:r>
-              <w:rPr>
-                <w:sz w:val="20"/>
-                <w:szCs w:val="20"/>
-              </w:rPr>
-              <w:t>giáo</w:t>
-            </w:r>
-            <w:proofErr w:type="spellEnd"/>
-            <w:r>
-              <w:rPr>
-                <w:sz w:val="20"/>
-                <w:szCs w:val="20"/>
-              </w:rPr>
-              <w:t xml:space="preserve"> </w:t>
-            </w:r>
-            <w:proofErr w:type="spellStart"/>
-            <w:r>
-              <w:rPr>
-                <w:sz w:val="20"/>
-                <w:szCs w:val="20"/>
-              </w:rPr>
-              <w:t>viên</w:t>
-            </w:r>
-            <w:proofErr w:type="spellEnd"/>
-            <w:r>
-              <w:rPr>
-                <w:sz w:val="20"/>
-                <w:szCs w:val="20"/>
-              </w:rPr>
-              <w:t xml:space="preserve"> </w:t>
-            </w:r>
-            <w:proofErr w:type="spellStart"/>
-            <w:r>
-              <w:rPr>
-                <w:sz w:val="20"/>
-                <w:szCs w:val="20"/>
-              </w:rPr>
-              <w:t>khác</w:t>
-            </w:r>
-            <w:proofErr w:type="spellEnd"/>
-            <w:r>
-              <w:rPr>
-                <w:sz w:val="20"/>
-                <w:szCs w:val="20"/>
-              </w:rPr>
-              <w:t xml:space="preserve"> </w:t>
-            </w:r>
-            <w:proofErr w:type="spellStart"/>
+              <w:t xml:space="preserve">Thứ tự xử lý khi giáo viên nghỉ 1 buổi: (1) Thử lùi lịch sang khung giờ khác trong tuần, không kéo dài thời gian khóa; (2) Nếu không lùi được, tìm giáo viên khác </w:t>
+            </w:r>
             <w:r>
               <w:rPr>
                 <w:sz w:val="20"/>
@@ -14141,61 +13841,12 @@
               </w:rPr>
               <w:t>đủ</w:t>
             </w:r>
-            <w:proofErr w:type="spellEnd"/>
-            <w:r>
-              <w:rPr>
-                <w:sz w:val="20"/>
-                <w:szCs w:val="20"/>
-              </w:rPr>
-              <w:t xml:space="preserve"> </w:t>
-            </w:r>
-            <w:proofErr w:type="spellStart"/>
-            <w:r>
-              <w:rPr>
-                <w:sz w:val="20"/>
-                <w:szCs w:val="20"/>
-              </w:rPr>
-              <w:t>cấp</w:t>
-            </w:r>
-            <w:proofErr w:type="spellEnd"/>
-            <w:r>
-              <w:rPr>
-                <w:sz w:val="20"/>
-                <w:szCs w:val="20"/>
-              </w:rPr>
-              <w:t xml:space="preserve"> </w:t>
-            </w:r>
-            <w:proofErr w:type="spellStart"/>
-            <w:r>
-              <w:rPr>
-                <w:sz w:val="20"/>
-                <w:szCs w:val="20"/>
-              </w:rPr>
-              <w:t>độ</w:t>
-            </w:r>
-            <w:proofErr w:type="spellEnd"/>
-            <w:r>
-              <w:rPr>
-                <w:sz w:val="20"/>
-                <w:szCs w:val="20"/>
-              </w:rPr>
-              <w:t xml:space="preserve"> </w:t>
-            </w:r>
-            <w:proofErr w:type="spellStart"/>
-            <w:r>
-              <w:rPr>
-                <w:sz w:val="20"/>
-                <w:szCs w:val="20"/>
-              </w:rPr>
-              <w:t>dạy</w:t>
-            </w:r>
-            <w:proofErr w:type="spellEnd"/>
-            <w:r>
-              <w:rPr>
-                <w:sz w:val="20"/>
-                <w:szCs w:val="20"/>
-              </w:rPr>
-              <w:t xml:space="preserve"> thay </w:t>
+            <w:r>
+              <w:rPr>
+                <w:sz w:val="20"/>
+                <w:szCs w:val="20"/>
+              </w:rPr>
+              <w:t xml:space="preserve"> cấp độ dạy thay </w:t>
             </w:r>
             <w:r>
               <w:rPr>
@@ -19128,7 +18779,6 @@
           <w:sz w:val="25"/>
           <w:szCs w:val="25"/>
         </w:rPr>
-        <w:lastRenderedPageBreak/>
         <w:t>5.4. Ma trận truy vết (Traceability Matrix)</w:t>
       </w:r>
       <w:bookmarkEnd w:id="61"/>
@@ -20328,127 +19978,13 @@
                 <w:szCs w:val="20"/>
               </w:rPr>
             </w:pPr>
-            <w:proofErr w:type="spellStart"/>
-            <w:r>
-              <w:rPr>
-                <w:sz w:val="20"/>
-                <w:szCs w:val="20"/>
-              </w:rPr>
-              <w:t>Hồ</w:t>
-            </w:r>
-            <w:proofErr w:type="spellEnd"/>
-            <w:r>
-              <w:rPr>
-                <w:sz w:val="20"/>
-                <w:szCs w:val="20"/>
-              </w:rPr>
-              <w:t xml:space="preserve"> </w:t>
-            </w:r>
-            <w:proofErr w:type="spellStart"/>
-            <w:r>
-              <w:rPr>
-                <w:sz w:val="20"/>
-                <w:szCs w:val="20"/>
-              </w:rPr>
-              <w:t>sơ</w:t>
-            </w:r>
-            <w:proofErr w:type="spellEnd"/>
-            <w:r>
-              <w:rPr>
-                <w:sz w:val="20"/>
-                <w:szCs w:val="20"/>
-              </w:rPr>
-              <w:t xml:space="preserve"> </w:t>
-            </w:r>
-            <w:proofErr w:type="spellStart"/>
-            <w:r>
-              <w:rPr>
-                <w:sz w:val="20"/>
-                <w:szCs w:val="20"/>
-              </w:rPr>
-              <w:t>nhân</w:t>
-            </w:r>
-            <w:proofErr w:type="spellEnd"/>
-            <w:r>
-              <w:rPr>
-                <w:sz w:val="20"/>
-                <w:szCs w:val="20"/>
-              </w:rPr>
-              <w:t xml:space="preserve"> </w:t>
-            </w:r>
-            <w:proofErr w:type="spellStart"/>
-            <w:r>
-              <w:rPr>
-                <w:sz w:val="20"/>
-                <w:szCs w:val="20"/>
-              </w:rPr>
-              <w:t>sự</w:t>
-            </w:r>
-            <w:proofErr w:type="spellEnd"/>
-            <w:r>
-              <w:rPr>
-                <w:sz w:val="20"/>
-                <w:szCs w:val="20"/>
-              </w:rPr>
-              <w:t xml:space="preserve"> </w:t>
-            </w:r>
-            <w:proofErr w:type="spellStart"/>
-            <w:r>
-              <w:rPr>
-                <w:sz w:val="20"/>
-                <w:szCs w:val="20"/>
-              </w:rPr>
-              <w:t>Quản</w:t>
-            </w:r>
-            <w:proofErr w:type="spellEnd"/>
-            <w:r>
-              <w:rPr>
-                <w:sz w:val="20"/>
-                <w:szCs w:val="20"/>
-              </w:rPr>
-              <w:t xml:space="preserve"> </w:t>
-            </w:r>
-            <w:proofErr w:type="spellStart"/>
-            <w:r>
-              <w:rPr>
-                <w:sz w:val="20"/>
-                <w:szCs w:val="20"/>
-              </w:rPr>
-              <w:t>lý</w:t>
-            </w:r>
-            <w:proofErr w:type="spellEnd"/>
-            <w:r>
-              <w:rPr>
-                <w:sz w:val="20"/>
-                <w:szCs w:val="20"/>
-              </w:rPr>
-              <w:t xml:space="preserve"> </w:t>
-            </w:r>
-            <w:proofErr w:type="spellStart"/>
-            <w:r>
-              <w:rPr>
-                <w:sz w:val="20"/>
-                <w:szCs w:val="20"/>
-              </w:rPr>
-              <w:t>trung</w:t>
-            </w:r>
-            <w:proofErr w:type="spellEnd"/>
-            <w:r>
-              <w:rPr>
-                <w:sz w:val="20"/>
-                <w:szCs w:val="20"/>
-              </w:rPr>
-              <w:t xml:space="preserve"> </w:t>
-            </w:r>
-            <w:proofErr w:type="spellStart"/>
-            <w:r>
-              <w:rPr>
-                <w:sz w:val="20"/>
-                <w:szCs w:val="20"/>
-              </w:rPr>
-              <w:t>tâm</w:t>
-            </w:r>
-            <w:proofErr w:type="spellEnd"/>
+            <w:r>
+              <w:rPr>
+                <w:sz w:val="20"/>
+                <w:szCs w:val="20"/>
+              </w:rPr>
+              <w:t>Hồ sơ nhân sự Quản lý trung tâm</w:t>
+            </w:r>
           </w:p>
         </w:tc>
         <w:tc>
@@ -20469,111 +20005,13 @@
                 <w:szCs w:val="20"/>
               </w:rPr>
             </w:pPr>
-            <w:proofErr w:type="spellStart"/>
-            <w:r>
-              <w:rPr>
-                <w:sz w:val="20"/>
-                <w:szCs w:val="20"/>
-              </w:rPr>
-              <w:t>Khởi</w:t>
-            </w:r>
-            <w:proofErr w:type="spellEnd"/>
-            <w:r>
-              <w:rPr>
-                <w:sz w:val="20"/>
-                <w:szCs w:val="20"/>
-              </w:rPr>
-              <w:t xml:space="preserve"> </w:t>
-            </w:r>
-            <w:proofErr w:type="spellStart"/>
-            <w:r>
-              <w:rPr>
-                <w:sz w:val="20"/>
-                <w:szCs w:val="20"/>
-              </w:rPr>
-              <w:t>tạo</w:t>
-            </w:r>
-            <w:proofErr w:type="spellEnd"/>
-            <w:r>
-              <w:rPr>
-                <w:sz w:val="20"/>
-                <w:szCs w:val="20"/>
-              </w:rPr>
-              <w:t xml:space="preserve"> </w:t>
-            </w:r>
-            <w:proofErr w:type="spellStart"/>
-            <w:r>
-              <w:rPr>
-                <w:sz w:val="20"/>
-                <w:szCs w:val="20"/>
-              </w:rPr>
-              <w:t>khi</w:t>
-            </w:r>
-            <w:proofErr w:type="spellEnd"/>
-            <w:r>
-              <w:rPr>
-                <w:sz w:val="20"/>
-                <w:szCs w:val="20"/>
-              </w:rPr>
-              <w:t xml:space="preserve"> </w:t>
-            </w:r>
-            <w:proofErr w:type="spellStart"/>
-            <w:r>
-              <w:rPr>
-                <w:sz w:val="20"/>
-                <w:szCs w:val="20"/>
-              </w:rPr>
-              <w:t>thiết</w:t>
-            </w:r>
-            <w:proofErr w:type="spellEnd"/>
-            <w:r>
-              <w:rPr>
-                <w:sz w:val="20"/>
-                <w:szCs w:val="20"/>
-              </w:rPr>
-              <w:t xml:space="preserve"> </w:t>
-            </w:r>
-            <w:proofErr w:type="spellStart"/>
-            <w:r>
-              <w:rPr>
-                <w:sz w:val="20"/>
-                <w:szCs w:val="20"/>
-              </w:rPr>
-              <w:t>lập</w:t>
-            </w:r>
-            <w:proofErr w:type="spellEnd"/>
-            <w:r>
-              <w:rPr>
-                <w:sz w:val="20"/>
-                <w:szCs w:val="20"/>
-              </w:rPr>
-              <w:t xml:space="preserve"> </w:t>
-            </w:r>
-            <w:proofErr w:type="spellStart"/>
-            <w:r>
-              <w:rPr>
-                <w:sz w:val="20"/>
-                <w:szCs w:val="20"/>
-              </w:rPr>
-              <w:t>hệ</w:t>
-            </w:r>
-            <w:proofErr w:type="spellEnd"/>
-            <w:r>
-              <w:rPr>
-                <w:sz w:val="20"/>
-                <w:szCs w:val="20"/>
-              </w:rPr>
-              <w:t xml:space="preserve"> </w:t>
-            </w:r>
-            <w:proofErr w:type="spellStart"/>
-            <w:r>
-              <w:rPr>
-                <w:sz w:val="20"/>
-                <w:szCs w:val="20"/>
-              </w:rPr>
-              <w:t>thống</w:t>
-            </w:r>
-            <w:proofErr w:type="spellEnd"/>
+            <w:r>
+              <w:rPr>
+                <w:sz w:val="20"/>
+                <w:szCs w:val="20"/>
+              </w:rPr>
+              <w:t>Khởi tạo khi thiết lập hệ thống</w:t>
+            </w:r>
           </w:p>
         </w:tc>
       </w:tr>
@@ -20887,6 +20325,7 @@
                 <w:sz w:val="20"/>
                 <w:szCs w:val="20"/>
               </w:rPr>
+              <w:lastRenderedPageBreak/>
               <w:t>Level</w:t>
             </w:r>
           </w:p>
@@ -20959,7 +20398,6 @@
                 <w:sz w:val="20"/>
                 <w:szCs w:val="20"/>
               </w:rPr>
-              <w:lastRenderedPageBreak/>
               <w:t>Class (Student Group)</w:t>
             </w:r>
           </w:p>
@@ -21824,6 +21262,7 @@
           <w:sz w:val="22"/>
           <w:szCs w:val="22"/>
         </w:rPr>
+        <w:lastRenderedPageBreak/>
         <w:t>Data Integrity</w:t>
       </w:r>
       <w:bookmarkEnd w:id="67"/>
@@ -21838,7 +21277,6 @@
         <w:spacing w:after="80" w:line="276" w:lineRule="auto"/>
       </w:pPr>
       <w:r>
-        <w:lastRenderedPageBreak/>
         <w:t>Không cho phép trùng lịch giáo viên (BR-SCH-01).</w:t>
       </w:r>
     </w:p>
@@ -21910,7 +21348,7 @@
 </file>
 
 <file path=word/numbering.xml><?xml version="1.0" encoding="utf-8"?>
-<w:numbering xmlns:wpc="http://schemas.microsoft.com/office/word/2010/wordprocessingCanvas" xmlns:cx="http://schemas.microsoft.com/office/drawing/2014/chartex" xmlns:cx1="http://schemas.microsoft.com/office/drawing/2015/9/8/chartex" xmlns:cx2="http://schemas.microsoft.com/office/drawing/2015/10/21/chartex" xmlns:cx3="http://schemas.microsoft.com/office/drawing/2016/5/9/chartex" xmlns:cx4="http://schemas.microsoft.com/office/drawing/2016/5/10/chartex" xmlns:cx5="http://schemas.microsoft.com/office/drawing/2016/5/11/chartex" xmlns:cx6="http://schemas.microsoft.com/office/drawing/2016/5/12/chartex" xmlns:cx7="http://schemas.microsoft.com/office/drawing/2016/5/13/chartex" xmlns:cx8="http://schemas.microsoft.com/office/drawing/2016/5/14/chartex" xmlns:mc="http://schemas.openxmlformats.org/markup-compatibility/2006" xmlns:aink="http://schemas.microsoft.com/office/drawing/2016/ink" xmlns:am3d="http://schemas.microsoft.com/office/drawing/2017/model3d" xmlns:o="urn:schemas-microsoft-com:office:office" xmlns:oel="http://schemas.microsoft.com/office/2019/extlst" xmlns:r="http://schemas.openxmlformats.org/officeDocument/2006/relationships" xmlns:m="http://schemas.openxmlformats.org/officeDocument/2006/math" xmlns:v="urn:schemas-microsoft-com:vml" xmlns:wp14="http://schemas.microsoft.com/office/word/2010/wordprocessingDrawing" xmlns:wp="http://schemas.openxmlformats.org/drawingml/2006/wordprocessingDrawing" xmlns:w10="urn:schemas-microsoft-com:office:word" xmlns:w="http://schemas.openxmlformats.org/wordprocessingml/2006/main" xmlns:w14="http://schemas.microsoft.com/office/word/2010/wordml" xmlns:w15="http://schemas.microsoft.com/office/word/2012/wordml" xmlns:w16cex="http://schemas.microsoft.com/office/word/2018/wordml/cex" xmlns:w16cid="http://schemas.microsoft.com/office/word/2016/wordml/cid" xmlns:w16="http://schemas.microsoft.com/office/word/2018/wordml" xmlns:w16sdtdh="http://schemas.microsoft.com/office/word/2020/wordml/sdtdatahash" xmlns:w16se="http://schemas.microsoft.com/office/word/2015/wordml/symex" xmlns:wpg="http://schemas.microsoft.com/office/word/2010/wordprocessingGroup" xmlns:wpi="http://schemas.microsoft.com/office/word/2010/wordprocessingInk" xmlns:wne="http://schemas.microsoft.com/office/word/2006/wordml" xmlns:wps="http://schemas.microsoft.com/office/word/2010/wordprocessingShape" mc:Ignorable="w14 w15 w16se w16cid w16 w16cex w16sdtdh wp14">
+<w:numbering xmlns:wpc="http://schemas.microsoft.com/office/word/2010/wordprocessingCanvas" xmlns:cx="http://schemas.microsoft.com/office/drawing/2014/chartex" xmlns:cx1="http://schemas.microsoft.com/office/drawing/2015/9/8/chartex" xmlns:cx2="http://schemas.microsoft.com/office/drawing/2015/10/21/chartex" xmlns:cx3="http://schemas.microsoft.com/office/drawing/2016/5/9/chartex" xmlns:cx4="http://schemas.microsoft.com/office/drawing/2016/5/10/chartex" xmlns:cx5="http://schemas.microsoft.com/office/drawing/2016/5/11/chartex" xmlns:cx6="http://schemas.microsoft.com/office/drawing/2016/5/12/chartex" xmlns:cx7="http://schemas.microsoft.com/office/drawing/2016/5/13/chartex" xmlns:cx8="http://schemas.microsoft.com/office/drawing/2016/5/14/chartex" xmlns:mc="http://schemas.openxmlformats.org/markup-compatibility/2006" xmlns:aink="http://schemas.microsoft.com/office/drawing/2016/ink" xmlns:am3d="http://schemas.microsoft.com/office/drawing/2017/model3d" xmlns:o="urn:schemas-microsoft-com:office:office" xmlns:oel="http://schemas.microsoft.com/office/2019/extlst" xmlns:r="http://schemas.openxmlformats.org/officeDocument/2006/relationships" xmlns:m="http://schemas.openxmlformats.org/officeDocument/2006/math" xmlns:v="urn:schemas-microsoft-com:vml" xmlns:wp14="http://schemas.microsoft.com/office/word/2010/wordprocessingDrawing" xmlns:wp="http://schemas.openxmlformats.org/drawingml/2006/wordprocessingDrawing" xmlns:w10="urn:schemas-microsoft-com:office:word" xmlns:w="http://schemas.openxmlformats.org/wordprocessingml/2006/main" xmlns:w14="http://schemas.microsoft.com/office/word/2010/wordml" xmlns:w15="http://schemas.microsoft.com/office/word/2012/wordml" xmlns:w16cex="http://schemas.microsoft.com/office/word/2018/wordml/cex" xmlns:w16cid="http://schemas.microsoft.com/office/word/2016/wordml/cid" xmlns:w16="http://schemas.microsoft.com/office/word/2018/wordml" xmlns:w16du="http://schemas.microsoft.com/office/word/2023/wordml/word16du" xmlns:w16sdtdh="http://schemas.microsoft.com/office/word/2020/wordml/sdtdatahash" xmlns:w16sdtfl="http://schemas.microsoft.com/office/word/2024/wordml/sdtformatlock" xmlns:w16se="http://schemas.microsoft.com/office/word/2015/wordml/symex" xmlns:wpg="http://schemas.microsoft.com/office/word/2010/wordprocessingGroup" xmlns:wpi="http://schemas.microsoft.com/office/word/2010/wordprocessingInk" xmlns:wne="http://schemas.microsoft.com/office/word/2006/wordml" xmlns:wps="http://schemas.microsoft.com/office/word/2010/wordprocessingShape" mc:Ignorable="w14 w15 w16se w16cid w16 w16cex w16sdtdh w16sdtfl w16du wp14">
   <w:abstractNum w:abstractNumId="0" w15:restartNumberingAfterBreak="0">
     <w:nsid w:val="521A6DEB"/>
     <w:multiLevelType w:val="hybridMultilevel"/>
@@ -22071,7 +21509,7 @@
 </file>
 
 <file path=word/styles.xml><?xml version="1.0" encoding="utf-8"?>
-<w:styles xmlns:mc="http://schemas.openxmlformats.org/markup-compatibility/2006" xmlns:r="http://schemas.openxmlformats.org/officeDocument/2006/relationships" xmlns:w="http://schemas.openxmlformats.org/wordprocessingml/2006/main" xmlns:w14="http://schemas.microsoft.com/office/word/2010/wordml" xmlns:w15="http://schemas.microsoft.com/office/word/2012/wordml" xmlns:w16cex="http://schemas.microsoft.com/office/word/2018/wordml/cex" xmlns:w16cid="http://schemas.microsoft.com/office/word/2016/wordml/cid" xmlns:w16="http://schemas.microsoft.com/office/word/2018/wordml" xmlns:w16sdtdh="http://schemas.microsoft.com/office/word/2020/wordml/sdtdatahash" xmlns:w16se="http://schemas.microsoft.com/office/word/2015/wordml/symex" mc:Ignorable="w14 w15 w16se w16cid w16 w16cex w16sdtdh">
+<w:styles xmlns:mc="http://schemas.openxmlformats.org/markup-compatibility/2006" xmlns:r="http://schemas.openxmlformats.org/officeDocument/2006/relationships" xmlns:w="http://schemas.openxmlformats.org/wordprocessingml/2006/main" xmlns:w14="http://schemas.microsoft.com/office/word/2010/wordml" xmlns:w15="http://schemas.microsoft.com/office/word/2012/wordml" xmlns:w16cex="http://schemas.microsoft.com/office/word/2018/wordml/cex" xmlns:w16cid="http://schemas.microsoft.com/office/word/2016/wordml/cid" xmlns:w16="http://schemas.microsoft.com/office/word/2018/wordml" xmlns:w16du="http://schemas.microsoft.com/office/word/2023/wordml/word16du" xmlns:w16sdtdh="http://schemas.microsoft.com/office/word/2020/wordml/sdtdatahash" xmlns:w16sdtfl="http://schemas.microsoft.com/office/word/2024/wordml/sdtformatlock" xmlns:w16se="http://schemas.microsoft.com/office/word/2015/wordml/symex" mc:Ignorable="w14 w15 w16se w16cid w16 w16cex w16sdtdh w16sdtfl w16du">
   <w:docDefaults>
     <w:rPrDefault>
       <w:rPr>
@@ -22550,6 +21988,7 @@
   <w:style w:type="character" w:default="1" w:styleId="DefaultParagraphFont">
     <w:name w:val="Default Paragraph Font"/>
     <w:uiPriority w:val="1"/>
+    <w:semiHidden/>
     <w:unhideWhenUsed/>
   </w:style>
   <w:style w:type="table" w:default="1" w:styleId="TableNormal">

</xml_diff>